<commit_message>
Fix API route and success redirect
</commit_message>
<xml_diff>
--- a/Flask_and_MongoDB_Bhavya_Raj_Singh.docx
+++ b/Flask_and_MongoDB_Bhavya_Raj_Singh.docx
@@ -403,11 +403,27 @@
         <w:ind w:left="360"/>
       </w:pPr>
       <w:r>
+        <w:t>The /api route returns the JSON list loaded from data.json. The /data route remains available as an alias.</w:t>
+      </w:r>
+    </w:p>
+    <w:p>
+      <w:pPr>
+        <w:pStyle w:val="Heading2"/>
+      </w:pPr>
+      <w:r>
+        <w:t>7. Test a successful form submission</w:t>
+      </w:r>
+    </w:p>
+    <w:p>
+      <w:pPr>
+        <w:ind w:left="360"/>
+      </w:pPr>
+      <w:r>
         <w:rPr>
           <w:rFonts w:ascii="Consolas" w:hAnsi="Consolas"/>
           <w:sz w:val="18"/>
         </w:rPr>
-        <w:t>Note: the current application returns the JSON list at /data. The assignment requirement expects the JSON-list route to be /api.</w:t>
+        <w:t>Invoke-WebRequest -Uri http://127.0.0.1:5000/submit -Method POST -Body @{name="Bhavya Raj Singh"; age="25"; city="Delhi"}</w:t>
       </w:r>
     </w:p>
     <w:p>
@@ -415,7 +431,7 @@
         <w:pStyle w:val="Heading2"/>
       </w:pPr>
       <w:r>
-        <w:t>7. Test a successful form submission</w:t>
+        <w:t>8. Test error handling</w:t>
       </w:r>
     </w:p>
     <w:p>
@@ -427,15 +443,7 @@
           <w:rFonts w:ascii="Consolas" w:hAnsi="Consolas"/>
           <w:sz w:val="18"/>
         </w:rPr>
-        <w:t>Invoke-WebRequest -Uri http://127.0.0.1:5000/submit -Method POST -Body @{name="Bhavya Raj Singh"; age="25"; city="Delhi"}</w:t>
-      </w:r>
-    </w:p>
-    <w:p>
-      <w:pPr>
-        <w:pStyle w:val="Heading2"/>
-      </w:pPr>
-      <w:r>
-        <w:t>8. Test error handling</w:t>
+        <w:t>Invoke-WebRequest -Uri http://127.0.0.1:5000/submit -Method POST -Body @{name=""; age=""; city=""}</w:t>
       </w:r>
     </w:p>
     <w:p>
@@ -447,7 +455,15 @@
           <w:rFonts w:ascii="Consolas" w:hAnsi="Consolas"/>
           <w:sz w:val="18"/>
         </w:rPr>
-        <w:t>Invoke-WebRequest -Uri http://127.0.0.1:5000/submit -Method POST -Body @{name=""; age=""; city=""}</w:t>
+        <w:t>Invoke-WebRequest -Uri http://127.0.0.1:5000/submit -Method POST -Body @{name="Test User"; age="abc"; city="Delhi"}</w:t>
+      </w:r>
+    </w:p>
+    <w:p>
+      <w:pPr>
+        <w:pStyle w:val="Heading2"/>
+      </w:pPr>
+      <w:r>
+        <w:t>9. Verify MongoDB Atlas</w:t>
       </w:r>
     </w:p>
     <w:p>
@@ -459,15 +475,7 @@
           <w:rFonts w:ascii="Consolas" w:hAnsi="Consolas"/>
           <w:sz w:val="18"/>
         </w:rPr>
-        <w:t>Invoke-WebRequest -Uri http://127.0.0.1:5000/submit -Method POST -Body @{name="Test User"; age="abc"; city="Delhi"}</w:t>
-      </w:r>
-    </w:p>
-    <w:p>
-      <w:pPr>
-        <w:pStyle w:val="Heading2"/>
-      </w:pPr>
-      <w:r>
-        <w:t>9. Verify MongoDB Atlas</w:t>
+        <w:t>Open MongoDB Atlas Data Explorer and select test &gt; test_collection. The submitted document should appear with name, age, and city fields.</w:t>
       </w:r>
     </w:p>
     <w:p>
@@ -479,7 +487,15 @@
           <w:rFonts w:ascii="Consolas" w:hAnsi="Consolas"/>
           <w:sz w:val="18"/>
         </w:rPr>
-        <w:t>Open MongoDB Atlas Data Explorer and select test &gt; test_collection. The submitted document should appear with name, age, and city fields.</w:t>
+        <w:t>Insert the provided MongoDB Atlas screenshot here.</w:t>
+      </w:r>
+    </w:p>
+    <w:p>
+      <w:pPr>
+        <w:pStyle w:val="Heading2"/>
+      </w:pPr>
+      <w:r>
+        <w:t>10. GitHub commands</w:t>
       </w:r>
     </w:p>
     <w:p>
@@ -491,15 +507,7 @@
           <w:rFonts w:ascii="Consolas" w:hAnsi="Consolas"/>
           <w:sz w:val="18"/>
         </w:rPr>
-        <w:t>Insert the provided MongoDB Atlas screenshot here.</w:t>
-      </w:r>
-    </w:p>
-    <w:p>
-      <w:pPr>
-        <w:pStyle w:val="Heading2"/>
-      </w:pPr>
-      <w:r>
-        <w:t>10. GitHub commands</w:t>
+        <w:t>git init</w:t>
       </w:r>
     </w:p>
     <w:p>
@@ -511,7 +519,7 @@
           <w:rFonts w:ascii="Consolas" w:hAnsi="Consolas"/>
           <w:sz w:val="18"/>
         </w:rPr>
-        <w:t>git init</w:t>
+        <w:t>git add .</w:t>
       </w:r>
     </w:p>
     <w:p>
@@ -523,7 +531,7 @@
           <w:rFonts w:ascii="Consolas" w:hAnsi="Consolas"/>
           <w:sz w:val="18"/>
         </w:rPr>
-        <w:t>git add .</w:t>
+        <w:t>git commit -m "Complete Flask MongoDB assignment"</w:t>
       </w:r>
     </w:p>
     <w:p>
@@ -535,7 +543,7 @@
           <w:rFonts w:ascii="Consolas" w:hAnsi="Consolas"/>
           <w:sz w:val="18"/>
         </w:rPr>
-        <w:t>git commit -m "Complete Flask MongoDB assignment"</w:t>
+        <w:t>git branch -M main</w:t>
       </w:r>
     </w:p>
     <w:p>
@@ -547,7 +555,7 @@
           <w:rFonts w:ascii="Consolas" w:hAnsi="Consolas"/>
           <w:sz w:val="18"/>
         </w:rPr>
-        <w:t>git branch -M main</w:t>
+        <w:t>git remote add origin YOUR_GITHUB_REPOSITORY_URL</w:t>
       </w:r>
     </w:p>
     <w:p>
@@ -559,18 +567,6 @@
           <w:rFonts w:ascii="Consolas" w:hAnsi="Consolas"/>
           <w:sz w:val="18"/>
         </w:rPr>
-        <w:t>git remote add origin YOUR_GITHUB_REPOSITORY_URL</w:t>
-      </w:r>
-    </w:p>
-    <w:p>
-      <w:pPr>
-        <w:ind w:left="360"/>
-      </w:pPr>
-      <w:r>
-        <w:rPr>
-          <w:rFonts w:ascii="Consolas" w:hAnsi="Consolas"/>
-          <w:sz w:val="18"/>
-        </w:rPr>
         <w:t>git push -u origin main</w:t>
       </w:r>
     </w:p>
@@ -583,16 +579,18 @@
       </w:r>
     </w:p>
     <w:p>
-      <w:pPr>
-        <w:ind w:left="360"/>
-      </w:pPr>
-      <w:r>
-        <w:rPr>
-          <w:rFonts w:ascii="Consolas" w:hAnsi="Consolas"/>
-          <w:sz w:val="18"/>
-        </w:rPr>
-        <w:t>Repository URL: Add the final GitHub repository URL here.</w:t>
-      </w:r>
+      <w:r>
+        <w:t xml:space="preserve">Repository URL: </w:t>
+      </w:r>
+      <w:hyperlink r:id="rId10">
+        <w:r>
+          <w:rPr>
+            <w:color w:val="0563C1"/>
+            <w:u w:val="single"/>
+          </w:rPr>
+          <w:t>https://github.com/Rajjjj06/Flask_and_MongoDB_Assignment_Bhavya_Raj_Singh</w:t>
+        </w:r>
+      </w:hyperlink>
     </w:p>
     <w:p>
       <w:pPr>

</xml_diff>